<commit_message>
Enhance volume control functionality by adding PING_STOP command and improving native volume management
</commit_message>
<xml_diff>
--- a/docs/Visioball_User_Guide.docx
+++ b/docs/Visioball_User_Guide.docx
@@ -1,6 +1,6 @@
 
 <file path=word/document.xml><?xml version="1.0" encoding="utf-8"?>
-<w:document xmlns:wpc="http://schemas.microsoft.com/office/word/2010/wordprocessingCanvas" xmlns:cx="http://schemas.microsoft.com/office/drawing/2014/chartex" xmlns:mc="http://schemas.openxmlformats.org/markup-compatibility/2006" xmlns:o="urn:schemas-microsoft-com:office:office" xmlns:r="http://schemas.openxmlformats.org/officeDocument/2006/relationships" xmlns:m="http://schemas.openxmlformats.org/officeDocument/2006/math" xmlns:v="urn:schemas-microsoft-com:vml" xmlns:wp14="http://schemas.microsoft.com/office/word/2010/wordprocessingDrawing" xmlns:wp="http://schemas.openxmlformats.org/drawingml/2006/wordprocessingDrawing" xmlns:w10="urn:schemas-microsoft-com:office:word" xmlns:w="http://schemas.openxmlformats.org/wordprocessingml/2006/main" xmlns:w14="http://schemas.microsoft.com/office/word/2010/wordml" xmlns:w15="http://schemas.microsoft.com/office/word/2012/wordml" xmlns:w16se="http://schemas.microsoft.com/office/word/2015/wordml/symex" xmlns:wpg="http://schemas.microsoft.com/office/word/2010/wordprocessingGroup" xmlns:wpi="http://schemas.microsoft.com/office/word/2010/wordprocessingInk" xmlns:wne="http://schemas.microsoft.com/office/word/2006/wordml" xmlns:wps="http://schemas.microsoft.com/office/word/2010/wordprocessingShape" mc:Ignorable="w14 w15 w16se wp14">
+<w:document xmlns:wpc="http://schemas.microsoft.com/office/word/2010/wordprocessingCanvas" xmlns:cx="http://schemas.microsoft.com/office/drawing/2014/chartex" xmlns:cx1="http://schemas.microsoft.com/office/drawing/2015/9/8/chartex" xmlns:cx2="http://schemas.microsoft.com/office/drawing/2015/10/21/chartex" xmlns:cx3="http://schemas.microsoft.com/office/drawing/2016/5/9/chartex" xmlns:cx4="http://schemas.microsoft.com/office/drawing/2016/5/10/chartex" xmlns:cx5="http://schemas.microsoft.com/office/drawing/2016/5/11/chartex" xmlns:cx6="http://schemas.microsoft.com/office/drawing/2016/5/12/chartex" xmlns:cx7="http://schemas.microsoft.com/office/drawing/2016/5/13/chartex" xmlns:cx8="http://schemas.microsoft.com/office/drawing/2016/5/14/chartex" xmlns:mc="http://schemas.openxmlformats.org/markup-compatibility/2006" xmlns:aink="http://schemas.microsoft.com/office/drawing/2016/ink" xmlns:am3d="http://schemas.microsoft.com/office/drawing/2017/model3d" xmlns:o="urn:schemas-microsoft-com:office:office" xmlns:oel="http://schemas.microsoft.com/office/2019/extlst" xmlns:r="http://schemas.openxmlformats.org/officeDocument/2006/relationships" xmlns:m="http://schemas.openxmlformats.org/officeDocument/2006/math" xmlns:v="urn:schemas-microsoft-com:vml" xmlns:wp14="http://schemas.microsoft.com/office/word/2010/wordprocessingDrawing" xmlns:wp="http://schemas.openxmlformats.org/drawingml/2006/wordprocessingDrawing" xmlns:w10="urn:schemas-microsoft-com:office:word" xmlns:w="http://schemas.openxmlformats.org/wordprocessingml/2006/main" xmlns:w14="http://schemas.microsoft.com/office/word/2010/wordml" xmlns:w15="http://schemas.microsoft.com/office/word/2012/wordml" xmlns:w16cex="http://schemas.microsoft.com/office/word/2018/wordml/cex" xmlns:w16cid="http://schemas.microsoft.com/office/word/2016/wordml/cid" xmlns:w16="http://schemas.microsoft.com/office/word/2018/wordml" xmlns:w16du="http://schemas.microsoft.com/office/word/2023/wordml/word16du" xmlns:w16sdtdh="http://schemas.microsoft.com/office/word/2020/wordml/sdtdatahash" xmlns:w16sdtfl="http://schemas.microsoft.com/office/word/2024/wordml/sdtformatlock" xmlns:w16se="http://schemas.microsoft.com/office/word/2015/wordml/symex" xmlns:wpg="http://schemas.microsoft.com/office/word/2010/wordprocessingGroup" xmlns:wpi="http://schemas.microsoft.com/office/word/2010/wordprocessingInk" xmlns:wne="http://schemas.microsoft.com/office/word/2006/wordml" xmlns:wps="http://schemas.microsoft.com/office/word/2010/wordprocessingShape" mc:Ignorable="w14 w15 w16se w16cid w16 w16cex w16sdtdh w16sdtfl w16du wp14">
   <w:body>
     <w:p>
       <w:pPr>
@@ -36,40 +36,6 @@
     </w:p>
     <w:p>
       <w:pPr>
-        <w:pStyle w:val="meta"/>
-        <w:rPr>
-          <w:rFonts w:ascii="Segoe UI" w:hAnsi="Segoe UI" w:cs="Segoe UI"/>
-          <w:lang w:val="en"/>
-        </w:rPr>
-      </w:pPr>
-      <w:r>
-        <w:rPr>
-          <w:rFonts w:ascii="Segoe UI" w:hAnsi="Segoe UI" w:cs="Segoe UI"/>
-          <w:lang w:val="en"/>
-        </w:rPr>
-        <w:t xml:space="preserve">Mobile app for the VisioBall smart training </w:t>
-      </w:r>
-      <w:proofErr w:type="gramStart"/>
-      <w:r>
-        <w:rPr>
-          <w:rFonts w:ascii="Segoe UI" w:hAnsi="Segoe UI" w:cs="Segoe UI"/>
-          <w:lang w:val="en"/>
-        </w:rPr>
-        <w:t>ball  |</w:t>
-      </w:r>
-      <w:proofErr w:type="gramEnd"/>
-      <w:r>
-        <w:rPr>
-          <w:rFonts w:ascii="Segoe UI" w:hAnsi="Segoe UI" w:cs="Segoe UI"/>
-          <w:lang w:val="en"/>
-        </w:rPr>
-        <w:t>  App version 1.0.0  |  Firmware v2.6.0  |  Last updated June 2026</w:t>
-      </w:r>
-      <w:bookmarkStart w:id="0" w:name="_GoBack"/>
-      <w:bookmarkEnd w:id="0"/>
-    </w:p>
-    <w:p>
-      <w:pPr>
         <w:shd w:val="clear" w:color="auto" w:fill="F6F3FC"/>
         <w:divId w:val="652954160"/>
         <w:rPr>
@@ -90,17 +56,65 @@
           <w:szCs w:val="22"/>
           <w:lang w:val="en"/>
         </w:rPr>
-        <w:t>What is Visioball?</w:t>
-      </w:r>
-      <w:r>
-        <w:rPr>
-          <w:rFonts w:ascii="Segoe UI" w:eastAsia="Times New Roman" w:hAnsi="Segoe UI" w:cs="Segoe UI"/>
-          <w:color w:val="1A1A2E"/>
-          <w:sz w:val="22"/>
-          <w:szCs w:val="22"/>
-          <w:lang w:val="en"/>
-        </w:rPr>
-        <w:t xml:space="preserve"> Visioball </w:t>
+        <w:t xml:space="preserve">What is </w:t>
+      </w:r>
+      <w:proofErr w:type="spellStart"/>
+      <w:r>
+        <w:rPr>
+          <w:rFonts w:ascii="Segoe UI" w:eastAsia="Times New Roman" w:hAnsi="Segoe UI" w:cs="Segoe UI"/>
+          <w:b/>
+          <w:bCs/>
+          <w:color w:val="1A1A2E"/>
+          <w:sz w:val="22"/>
+          <w:szCs w:val="22"/>
+          <w:lang w:val="en"/>
+        </w:rPr>
+        <w:t>Visioball</w:t>
+      </w:r>
+      <w:proofErr w:type="spellEnd"/>
+      <w:r>
+        <w:rPr>
+          <w:rFonts w:ascii="Segoe UI" w:eastAsia="Times New Roman" w:hAnsi="Segoe UI" w:cs="Segoe UI"/>
+          <w:b/>
+          <w:bCs/>
+          <w:color w:val="1A1A2E"/>
+          <w:sz w:val="22"/>
+          <w:szCs w:val="22"/>
+          <w:lang w:val="en"/>
+        </w:rPr>
+        <w:t>?</w:t>
+      </w:r>
+      <w:r>
+        <w:rPr>
+          <w:rFonts w:ascii="Segoe UI" w:eastAsia="Times New Roman" w:hAnsi="Segoe UI" w:cs="Segoe UI"/>
+          <w:color w:val="1A1A2E"/>
+          <w:sz w:val="22"/>
+          <w:szCs w:val="22"/>
+          <w:lang w:val="en"/>
+        </w:rPr>
+        <w:t xml:space="preserve"> </w:t>
+      </w:r>
+      <w:proofErr w:type="spellStart"/>
+      <w:r>
+        <w:rPr>
+          <w:rFonts w:ascii="Segoe UI" w:eastAsia="Times New Roman" w:hAnsi="Segoe UI" w:cs="Segoe UI"/>
+          <w:color w:val="1A1A2E"/>
+          <w:sz w:val="22"/>
+          <w:szCs w:val="22"/>
+          <w:lang w:val="en"/>
+        </w:rPr>
+        <w:t>Visioball</w:t>
+      </w:r>
+      <w:proofErr w:type="spellEnd"/>
+      <w:r>
+        <w:rPr>
+          <w:rFonts w:ascii="Segoe UI" w:eastAsia="Times New Roman" w:hAnsi="Segoe UI" w:cs="Segoe UI"/>
+          <w:color w:val="1A1A2E"/>
+          <w:sz w:val="22"/>
+          <w:szCs w:val="22"/>
+          <w:lang w:val="en"/>
+        </w:rPr>
+        <w:t xml:space="preserve"> </w:t>
       </w:r>
       <w:r>
         <w:rPr>
@@ -164,8 +178,22 @@
           <w:szCs w:val="22"/>
           <w:lang w:val="en"/>
         </w:rPr>
-        <w:t>The VisioBall</w:t>
-      </w:r>
+        <w:t xml:space="preserve">The </w:t>
+      </w:r>
+      <w:proofErr w:type="spellStart"/>
+      <w:r>
+        <w:rPr>
+          <w:rFonts w:ascii="Segoe UI" w:eastAsia="Times New Roman" w:hAnsi="Segoe UI" w:cs="Segoe UI"/>
+          <w:b/>
+          <w:bCs/>
+          <w:color w:val="1A1A2E"/>
+          <w:sz w:val="22"/>
+          <w:szCs w:val="22"/>
+          <w:lang w:val="en"/>
+        </w:rPr>
+        <w:t>VisioBall</w:t>
+      </w:r>
+      <w:proofErr w:type="spellEnd"/>
       <w:r>
         <w:rPr>
           <w:rFonts w:ascii="Segoe UI" w:eastAsia="Times New Roman" w:hAnsi="Segoe UI" w:cs="Segoe UI"/>
@@ -260,7 +288,33 @@
           <w:szCs w:val="22"/>
           <w:lang w:val="en"/>
         </w:rPr>
-        <w:t>The Visioball app</w:t>
+        <w:t xml:space="preserve">The </w:t>
+      </w:r>
+      <w:proofErr w:type="spellStart"/>
+      <w:r>
+        <w:rPr>
+          <w:rFonts w:ascii="Segoe UI" w:eastAsia="Times New Roman" w:hAnsi="Segoe UI" w:cs="Segoe UI"/>
+          <w:b/>
+          <w:bCs/>
+          <w:color w:val="1A1A2E"/>
+          <w:sz w:val="22"/>
+          <w:szCs w:val="22"/>
+          <w:lang w:val="en"/>
+        </w:rPr>
+        <w:t>Visioball</w:t>
+      </w:r>
+      <w:proofErr w:type="spellEnd"/>
+      <w:r>
+        <w:rPr>
+          <w:rFonts w:ascii="Segoe UI" w:eastAsia="Times New Roman" w:hAnsi="Segoe UI" w:cs="Segoe UI"/>
+          <w:b/>
+          <w:bCs/>
+          <w:color w:val="1A1A2E"/>
+          <w:sz w:val="22"/>
+          <w:szCs w:val="22"/>
+          <w:lang w:val="en"/>
+        </w:rPr>
+        <w:t xml:space="preserve"> app</w:t>
       </w:r>
       <w:r>
         <w:rPr>
@@ -429,6 +483,7 @@
         </w:rPr>
         <w:t xml:space="preserve"> the </w:t>
       </w:r>
+      <w:proofErr w:type="spellStart"/>
       <w:r>
         <w:rPr>
           <w:rStyle w:val="HTMLCode"/>
@@ -436,6 +491,7 @@
         </w:rPr>
         <w:t>visiobal.apk</w:t>
       </w:r>
+      <w:proofErr w:type="spellEnd"/>
       <w:r>
         <w:rPr>
           <w:rFonts w:ascii="Segoe UI" w:eastAsia="Times New Roman" w:hAnsi="Segoe UI" w:cs="Segoe UI"/>
@@ -538,6 +594,7 @@
         </w:rPr>
         <w:t xml:space="preserve"> When it finishes, the </w:t>
       </w:r>
+      <w:proofErr w:type="spellStart"/>
       <w:r>
         <w:rPr>
           <w:rFonts w:ascii="Segoe UI" w:eastAsia="Times New Roman" w:hAnsi="Segoe UI" w:cs="Segoe UI"/>
@@ -550,6 +607,7 @@
         </w:rPr>
         <w:t>Visioball</w:t>
       </w:r>
+      <w:proofErr w:type="spellEnd"/>
       <w:r>
         <w:rPr>
           <w:rFonts w:ascii="Segoe UI" w:eastAsia="Times New Roman" w:hAnsi="Segoe UI" w:cs="Segoe UI"/>
@@ -892,7 +950,21 @@
               <w:rPr>
                 <w:rStyle w:val="HTMLCode"/>
               </w:rPr>
-              <w:t>git clone &lt;repo-url&gt;</w:t>
+              <w:t>git clone &lt;repo-</w:t>
+            </w:r>
+            <w:proofErr w:type="spellStart"/>
+            <w:r>
+              <w:rPr>
+                <w:rStyle w:val="HTMLCode"/>
+              </w:rPr>
+              <w:t>url</w:t>
+            </w:r>
+            <w:proofErr w:type="spellEnd"/>
+            <w:r>
+              <w:rPr>
+                <w:rStyle w:val="HTMLCode"/>
+              </w:rPr>
+              <w:t>&gt;</w:t>
             </w:r>
           </w:p>
         </w:tc>
@@ -967,8 +1039,16 @@
               <w:rPr>
                 <w:rStyle w:val="HTMLCode"/>
               </w:rPr>
-              <w:t>cd visiobal</w:t>
-            </w:r>
+              <w:t xml:space="preserve">cd </w:t>
+            </w:r>
+            <w:proofErr w:type="spellStart"/>
+            <w:r>
+              <w:rPr>
+                <w:rStyle w:val="HTMLCode"/>
+              </w:rPr>
+              <w:t>visiobal</w:t>
+            </w:r>
+            <w:proofErr w:type="spellEnd"/>
           </w:p>
         </w:tc>
       </w:tr>
@@ -1300,6 +1380,7 @@
         </w:rPr>
         <w:t xml:space="preserve">expo </w:t>
       </w:r>
+      <w:proofErr w:type="spellStart"/>
       <w:proofErr w:type="gramStart"/>
       <w:r>
         <w:rPr>
@@ -1308,6 +1389,7 @@
         </w:rPr>
         <w:t>run:android</w:t>
       </w:r>
+      <w:proofErr w:type="spellEnd"/>
       <w:proofErr w:type="gramEnd"/>
       <w:r>
         <w:rPr>
@@ -1485,6 +1567,7 @@
         </w:rPr>
         <w:t xml:space="preserve"> over Bluetooth under the name </w:t>
       </w:r>
+      <w:proofErr w:type="spellStart"/>
       <w:r>
         <w:rPr>
           <w:rStyle w:val="HTMLCode"/>
@@ -1492,6 +1575,7 @@
         </w:rPr>
         <w:t>VisioBal</w:t>
       </w:r>
+      <w:proofErr w:type="spellEnd"/>
       <w:r>
         <w:rPr>
           <w:rFonts w:ascii="Segoe UI" w:eastAsia="Times New Roman" w:hAnsi="Segoe UI" w:cs="Segoe UI"/>
@@ -1633,7 +1717,29 @@
           <w:szCs w:val="22"/>
           <w:lang w:val="en"/>
         </w:rPr>
-        <w:t xml:space="preserve">Open the Visioball app. It shows a short </w:t>
+        <w:t xml:space="preserve">Open the </w:t>
+      </w:r>
+      <w:proofErr w:type="spellStart"/>
+      <w:r>
+        <w:rPr>
+          <w:rFonts w:ascii="Segoe UI" w:eastAsia="Times New Roman" w:hAnsi="Segoe UI" w:cs="Segoe UI"/>
+          <w:color w:val="1A1A2E"/>
+          <w:sz w:val="22"/>
+          <w:szCs w:val="22"/>
+          <w:lang w:val="en"/>
+        </w:rPr>
+        <w:t>Visioball</w:t>
+      </w:r>
+      <w:proofErr w:type="spellEnd"/>
+      <w:r>
+        <w:rPr>
+          <w:rFonts w:ascii="Segoe UI" w:eastAsia="Times New Roman" w:hAnsi="Segoe UI" w:cs="Segoe UI"/>
+          <w:color w:val="1A1A2E"/>
+          <w:sz w:val="22"/>
+          <w:szCs w:val="22"/>
+          <w:lang w:val="en"/>
+        </w:rPr>
+        <w:t xml:space="preserve"> app. It shows a short </w:t>
       </w:r>
       <w:r>
         <w:rPr>
@@ -1798,6 +1904,7 @@
         </w:rPr>
         <w:t xml:space="preserve"> screen and searches for ~8 seconds. Any ball named </w:t>
       </w:r>
+      <w:proofErr w:type="spellStart"/>
       <w:r>
         <w:rPr>
           <w:rStyle w:val="HTMLCode"/>
@@ -1805,6 +1912,7 @@
         </w:rPr>
         <w:t>VisioBal</w:t>
       </w:r>
+      <w:proofErr w:type="spellEnd"/>
       <w:r>
         <w:rPr>
           <w:rFonts w:ascii="Segoe UI" w:eastAsia="Times New Roman" w:hAnsi="Segoe UI" w:cs="Segoe UI"/>
@@ -2355,8 +2463,20 @@
           <w:szCs w:val="22"/>
           <w:lang w:val="en"/>
         </w:rPr>
-        <w:t xml:space="preserve"> (bottom-right of the ball): colour</w:t>
-      </w:r>
+        <w:t xml:space="preserve"> (bottom-right of the ball): </w:t>
+      </w:r>
+      <w:proofErr w:type="spellStart"/>
+      <w:r>
+        <w:rPr>
+          <w:rFonts w:ascii="Segoe UI" w:eastAsia="Times New Roman" w:hAnsi="Segoe UI" w:cs="Segoe UI"/>
+          <w:color w:val="1A1A2E"/>
+          <w:sz w:val="22"/>
+          <w:szCs w:val="22"/>
+          <w:lang w:val="en"/>
+        </w:rPr>
+        <w:t>colour</w:t>
+      </w:r>
+      <w:proofErr w:type="spellEnd"/>
       <w:r>
         <w:rPr>
           <w:rFonts w:ascii="Segoe UI" w:eastAsia="Times New Roman" w:hAnsi="Segoe UI" w:cs="Segoe UI"/>
@@ -2822,7 +2942,29 @@
           <w:szCs w:val="22"/>
           <w:lang w:val="en"/>
         </w:rPr>
-        <w:t>An animated equaliser shows on the active track while playing.</w:t>
+        <w:t xml:space="preserve">An animated </w:t>
+      </w:r>
+      <w:proofErr w:type="spellStart"/>
+      <w:r>
+        <w:rPr>
+          <w:rFonts w:ascii="Segoe UI" w:eastAsia="Times New Roman" w:hAnsi="Segoe UI" w:cs="Segoe UI"/>
+          <w:color w:val="1A1A2E"/>
+          <w:sz w:val="22"/>
+          <w:szCs w:val="22"/>
+          <w:lang w:val="en"/>
+        </w:rPr>
+        <w:t>equaliser</w:t>
+      </w:r>
+      <w:proofErr w:type="spellEnd"/>
+      <w:r>
+        <w:rPr>
+          <w:rFonts w:ascii="Segoe UI" w:eastAsia="Times New Roman" w:hAnsi="Segoe UI" w:cs="Segoe UI"/>
+          <w:color w:val="1A1A2E"/>
+          <w:sz w:val="22"/>
+          <w:szCs w:val="22"/>
+          <w:lang w:val="en"/>
+        </w:rPr>
+        <w:t xml:space="preserve"> shows on the active track while playing.</w:t>
       </w:r>
     </w:p>
     <w:p>
@@ -2848,6 +2990,7 @@
         </w:rPr>
         <w:t xml:space="preserve">Play/pause and track selection are </w:t>
       </w:r>
+      <w:proofErr w:type="spellStart"/>
       <w:r>
         <w:rPr>
           <w:rFonts w:ascii="Segoe UI" w:eastAsia="Times New Roman" w:hAnsi="Segoe UI" w:cs="Segoe UI"/>
@@ -2860,6 +3003,7 @@
         </w:rPr>
         <w:t>synchronised</w:t>
       </w:r>
+      <w:proofErr w:type="spellEnd"/>
       <w:r>
         <w:rPr>
           <w:rFonts w:ascii="Segoe UI" w:eastAsia="Times New Roman" w:hAnsi="Segoe UI" w:cs="Segoe UI"/>
@@ -4458,12 +4602,14 @@
                 <w:szCs w:val="21"/>
               </w:rPr>
             </w:pPr>
+            <w:proofErr w:type="spellStart"/>
             <w:r>
               <w:rPr>
                 <w:rStyle w:val="HTMLCode"/>
               </w:rPr>
               <w:t>VisioBal</w:t>
             </w:r>
+            <w:proofErr w:type="spellEnd"/>
           </w:p>
         </w:tc>
       </w:tr>
@@ -5735,7 +5881,21 @@
               <w:rPr>
                 <w:rStyle w:val="HTMLCode"/>
               </w:rPr>
-              <w:t>FREQ:&lt;hz&gt;</w:t>
+              <w:t>FREQ:&lt;</w:t>
+            </w:r>
+            <w:proofErr w:type="spellStart"/>
+            <w:r>
+              <w:rPr>
+                <w:rStyle w:val="HTMLCode"/>
+              </w:rPr>
+              <w:t>hz</w:t>
+            </w:r>
+            <w:proofErr w:type="spellEnd"/>
+            <w:r>
+              <w:rPr>
+                <w:rStyle w:val="HTMLCode"/>
+              </w:rPr>
+              <w:t>&gt;</w:t>
             </w:r>
           </w:p>
         </w:tc>
@@ -6112,7 +6272,29 @@
           <w:szCs w:val="22"/>
           <w:lang w:val="en"/>
         </w:rPr>
-        <w:t xml:space="preserve"> while connected, the app reads the ball's battery characteristic about every 1.5 seconds and updates the colour-coded indicator.</w:t>
+        <w:t xml:space="preserve"> while connected, the app reads the ball's battery characteristic about every 1.5 seconds and updates the </w:t>
+      </w:r>
+      <w:proofErr w:type="spellStart"/>
+      <w:r>
+        <w:rPr>
+          <w:rFonts w:ascii="Segoe UI" w:eastAsia="Times New Roman" w:hAnsi="Segoe UI" w:cs="Segoe UI"/>
+          <w:color w:val="1A1A2E"/>
+          <w:sz w:val="22"/>
+          <w:szCs w:val="22"/>
+          <w:lang w:val="en"/>
+        </w:rPr>
+        <w:t>colour</w:t>
+      </w:r>
+      <w:proofErr w:type="spellEnd"/>
+      <w:r>
+        <w:rPr>
+          <w:rFonts w:ascii="Segoe UI" w:eastAsia="Times New Roman" w:hAnsi="Segoe UI" w:cs="Segoe UI"/>
+          <w:color w:val="1A1A2E"/>
+          <w:sz w:val="22"/>
+          <w:szCs w:val="22"/>
+          <w:lang w:val="en"/>
+        </w:rPr>
+        <w:t>-coded indicator.</w:t>
       </w:r>
     </w:p>
     <w:p>
@@ -6491,6 +6673,7 @@
         </w:rPr>
         <w:t xml:space="preserve"> the ESP32 runs a BLE server, advertises as </w:t>
       </w:r>
+      <w:proofErr w:type="spellStart"/>
       <w:r>
         <w:rPr>
           <w:rStyle w:val="HTMLCode"/>
@@ -6498,6 +6681,7 @@
         </w:rPr>
         <w:t>VisioBal</w:t>
       </w:r>
+      <w:proofErr w:type="spellEnd"/>
       <w:r>
         <w:rPr>
           <w:rFonts w:ascii="Segoe UI" w:eastAsia="Times New Roman" w:hAnsi="Segoe UI" w:cs="Segoe UI"/>
@@ -6546,6 +6730,7 @@
         </w:rPr>
         <w:t xml:space="preserve"> built with </w:t>
       </w:r>
+      <w:proofErr w:type="spellStart"/>
       <w:r>
         <w:rPr>
           <w:rFonts w:ascii="Segoe UI" w:eastAsia="Times New Roman" w:hAnsi="Segoe UI" w:cs="Segoe UI"/>
@@ -6558,6 +6743,7 @@
         </w:rPr>
         <w:t>PlatformIO</w:t>
       </w:r>
+      <w:proofErr w:type="spellEnd"/>
       <w:r>
         <w:rPr>
           <w:rFonts w:ascii="Segoe UI" w:eastAsia="Times New Roman" w:hAnsi="Segoe UI" w:cs="Segoe UI"/>
@@ -6568,12 +6754,21 @@
         </w:rPr>
         <w:t xml:space="preserve"> (Arduino framework). Key files: </w:t>
       </w:r>
+      <w:proofErr w:type="spellStart"/>
       <w:r>
         <w:rPr>
           <w:rStyle w:val="HTMLCode"/>
           <w:lang w:val="en"/>
         </w:rPr>
-        <w:t>src/main.cpp</w:t>
+        <w:t>src</w:t>
+      </w:r>
+      <w:proofErr w:type="spellEnd"/>
+      <w:r>
+        <w:rPr>
+          <w:rStyle w:val="HTMLCode"/>
+          <w:lang w:val="en"/>
+        </w:rPr>
+        <w:t>/main.cpp</w:t>
       </w:r>
       <w:r>
         <w:rPr>
@@ -6585,12 +6780,21 @@
         </w:rPr>
         <w:t xml:space="preserve"> (audio + melodies) and </w:t>
       </w:r>
+      <w:proofErr w:type="spellStart"/>
       <w:r>
         <w:rPr>
           <w:rStyle w:val="HTMLCode"/>
           <w:lang w:val="en"/>
         </w:rPr>
-        <w:t>src/BLEManager.cpp</w:t>
+        <w:t>src</w:t>
+      </w:r>
+      <w:proofErr w:type="spellEnd"/>
+      <w:r>
+        <w:rPr>
+          <w:rStyle w:val="HTMLCode"/>
+          <w:lang w:val="en"/>
+        </w:rPr>
+        <w:t>/BLEManager.cpp</w:t>
       </w:r>
       <w:r>
         <w:rPr>
@@ -6660,6 +6864,7 @@
         </w:rPr>
         <w:t xml:space="preserve">Get the newer </w:t>
       </w:r>
+      <w:proofErr w:type="spellStart"/>
       <w:r>
         <w:rPr>
           <w:rStyle w:val="HTMLCode"/>
@@ -6667,6 +6872,7 @@
         </w:rPr>
         <w:t>visiobal.apk</w:t>
       </w:r>
+      <w:proofErr w:type="spellEnd"/>
       <w:r>
         <w:rPr>
           <w:rFonts w:ascii="Segoe UI" w:eastAsia="Times New Roman" w:hAnsi="Segoe UI" w:cs="Segoe UI"/>
@@ -6838,6 +7044,7 @@
         </w:rPr>
         <w:t xml:space="preserve">Firmware lives in the separate </w:t>
       </w:r>
+      <w:proofErr w:type="spellStart"/>
       <w:r>
         <w:rPr>
           <w:rFonts w:ascii="Segoe UI" w:hAnsi="Segoe UI" w:cs="Segoe UI"/>
@@ -6848,17 +7055,52 @@
           <w:szCs w:val="22"/>
           <w:lang w:val="en"/>
         </w:rPr>
-        <w:t>visiobal-hardware</w:t>
-      </w:r>
+        <w:t>visiobal</w:t>
+      </w:r>
+      <w:proofErr w:type="spellEnd"/>
       <w:r>
         <w:rPr>
           <w:rFonts w:ascii="Segoe UI" w:hAnsi="Segoe UI" w:cs="Segoe UI"/>
-          <w:color w:val="1A1A2E"/>
-          <w:sz w:val="22"/>
-          <w:szCs w:val="22"/>
-          <w:lang w:val="en"/>
-        </w:rPr>
-        <w:t xml:space="preserve"> repository and is flashed over USB with PlatformIO:</w:t>
+          <w:b/>
+          <w:bCs/>
+          <w:color w:val="1A1A2E"/>
+          <w:sz w:val="22"/>
+          <w:szCs w:val="22"/>
+          <w:lang w:val="en"/>
+        </w:rPr>
+        <w:t>-hardware</w:t>
+      </w:r>
+      <w:r>
+        <w:rPr>
+          <w:rFonts w:ascii="Segoe UI" w:hAnsi="Segoe UI" w:cs="Segoe UI"/>
+          <w:color w:val="1A1A2E"/>
+          <w:sz w:val="22"/>
+          <w:szCs w:val="22"/>
+          <w:lang w:val="en"/>
+        </w:rPr>
+        <w:t xml:space="preserve"> repository and is flashed over USB with </w:t>
+      </w:r>
+      <w:proofErr w:type="spellStart"/>
+      <w:r>
+        <w:rPr>
+          <w:rFonts w:ascii="Segoe UI" w:hAnsi="Segoe UI" w:cs="Segoe UI"/>
+          <w:color w:val="1A1A2E"/>
+          <w:sz w:val="22"/>
+          <w:szCs w:val="22"/>
+          <w:lang w:val="en"/>
+        </w:rPr>
+        <w:t>PlatformIO</w:t>
+      </w:r>
+      <w:proofErr w:type="spellEnd"/>
+      <w:r>
+        <w:rPr>
+          <w:rFonts w:ascii="Segoe UI" w:hAnsi="Segoe UI" w:cs="Segoe UI"/>
+          <w:color w:val="1A1A2E"/>
+          <w:sz w:val="22"/>
+          <w:szCs w:val="22"/>
+          <w:lang w:val="en"/>
+        </w:rPr>
+        <w:t>:</w:t>
       </w:r>
     </w:p>
     <w:p>
@@ -6884,7 +7126,29 @@
           <w:szCs w:val="22"/>
           <w:lang w:val="en"/>
         </w:rPr>
-        <w:t>Open the hardware project in VS Code with the PlatformIO extension.</w:t>
+        <w:t xml:space="preserve">Open the hardware project in VS Code with the </w:t>
+      </w:r>
+      <w:proofErr w:type="spellStart"/>
+      <w:r>
+        <w:rPr>
+          <w:rFonts w:ascii="Segoe UI" w:eastAsia="Times New Roman" w:hAnsi="Segoe UI" w:cs="Segoe UI"/>
+          <w:color w:val="1A1A2E"/>
+          <w:sz w:val="22"/>
+          <w:szCs w:val="22"/>
+          <w:lang w:val="en"/>
+        </w:rPr>
+        <w:t>PlatformIO</w:t>
+      </w:r>
+      <w:proofErr w:type="spellEnd"/>
+      <w:r>
+        <w:rPr>
+          <w:rFonts w:ascii="Segoe UI" w:eastAsia="Times New Roman" w:hAnsi="Segoe UI" w:cs="Segoe UI"/>
+          <w:color w:val="1A1A2E"/>
+          <w:sz w:val="22"/>
+          <w:szCs w:val="22"/>
+          <w:lang w:val="en"/>
+        </w:rPr>
+        <w:t xml:space="preserve"> extension.</w:t>
       </w:r>
     </w:p>
     <w:p>
@@ -6960,22 +7224,53 @@
         </w:rPr>
         <w:t xml:space="preserve"> (or run </w:t>
       </w:r>
+      <w:proofErr w:type="spellStart"/>
       <w:r>
         <w:rPr>
           <w:rStyle w:val="HTMLCode"/>
           <w:lang w:val="en"/>
         </w:rPr>
-        <w:t>pio run -t upload</w:t>
-      </w:r>
-      <w:r>
-        <w:rPr>
-          <w:rFonts w:ascii="Segoe UI" w:eastAsia="Times New Roman" w:hAnsi="Segoe UI" w:cs="Segoe UI"/>
-          <w:color w:val="1A1A2E"/>
-          <w:sz w:val="22"/>
-          <w:szCs w:val="22"/>
-          <w:lang w:val="en"/>
-        </w:rPr>
-        <w:t>). PlatformIO compiles and flashes the board.</w:t>
+        <w:t>pio</w:t>
+      </w:r>
+      <w:proofErr w:type="spellEnd"/>
+      <w:r>
+        <w:rPr>
+          <w:rStyle w:val="HTMLCode"/>
+          <w:lang w:val="en"/>
+        </w:rPr>
+        <w:t xml:space="preserve"> run -t upload</w:t>
+      </w:r>
+      <w:r>
+        <w:rPr>
+          <w:rFonts w:ascii="Segoe UI" w:eastAsia="Times New Roman" w:hAnsi="Segoe UI" w:cs="Segoe UI"/>
+          <w:color w:val="1A1A2E"/>
+          <w:sz w:val="22"/>
+          <w:szCs w:val="22"/>
+          <w:lang w:val="en"/>
+        </w:rPr>
+        <w:t xml:space="preserve">). </w:t>
+      </w:r>
+      <w:proofErr w:type="spellStart"/>
+      <w:r>
+        <w:rPr>
+          <w:rFonts w:ascii="Segoe UI" w:eastAsia="Times New Roman" w:hAnsi="Segoe UI" w:cs="Segoe UI"/>
+          <w:color w:val="1A1A2E"/>
+          <w:sz w:val="22"/>
+          <w:szCs w:val="22"/>
+          <w:lang w:val="en"/>
+        </w:rPr>
+        <w:t>PlatformIO</w:t>
+      </w:r>
+      <w:proofErr w:type="spellEnd"/>
+      <w:r>
+        <w:rPr>
+          <w:rFonts w:ascii="Segoe UI" w:eastAsia="Times New Roman" w:hAnsi="Segoe UI" w:cs="Segoe UI"/>
+          <w:color w:val="1A1A2E"/>
+          <w:sz w:val="22"/>
+          <w:szCs w:val="22"/>
+          <w:lang w:val="en"/>
+        </w:rPr>
+        <w:t xml:space="preserve"> compiles and flashes the board.</w:t>
       </w:r>
     </w:p>
     <w:p>
@@ -7024,29 +7319,7 @@
           <w:szCs w:val="22"/>
           <w:lang w:val="en"/>
         </w:rPr>
-        <w:t xml:space="preserve"> at 115200 </w:t>
-      </w:r>
-      <w:proofErr w:type="gramStart"/>
-      <w:r>
-        <w:rPr>
-          <w:rFonts w:ascii="Segoe UI" w:eastAsia="Times New Roman" w:hAnsi="Segoe UI" w:cs="Segoe UI"/>
-          <w:color w:val="1A1A2E"/>
-          <w:sz w:val="22"/>
-          <w:szCs w:val="22"/>
-          <w:lang w:val="en"/>
-        </w:rPr>
-        <w:t>baud</w:t>
-      </w:r>
-      <w:proofErr w:type="gramEnd"/>
-      <w:r>
-        <w:rPr>
-          <w:rFonts w:ascii="Segoe UI" w:eastAsia="Times New Roman" w:hAnsi="Segoe UI" w:cs="Segoe UI"/>
-          <w:color w:val="1A1A2E"/>
-          <w:sz w:val="22"/>
-          <w:szCs w:val="22"/>
-          <w:lang w:val="en"/>
-        </w:rPr>
-        <w:t xml:space="preserve"> to see connection and command logs.</w:t>
+        <w:t xml:space="preserve"> at 115200 baud to see connection and command logs.</w:t>
       </w:r>
     </w:p>
     <w:p>
@@ -7431,7 +7704,27 @@
                 <w:sz w:val="21"/>
                 <w:szCs w:val="21"/>
               </w:rPr>
-              <w:t>Go to the phone's app settings for Visioball and allow Bluetooth (nearby devices) and Location.</w:t>
+              <w:t xml:space="preserve">Go to the phone's app settings for </w:t>
+            </w:r>
+            <w:proofErr w:type="spellStart"/>
+            <w:r>
+              <w:rPr>
+                <w:rFonts w:ascii="Segoe UI" w:eastAsia="Times New Roman" w:hAnsi="Segoe UI" w:cs="Segoe UI"/>
+                <w:color w:val="1A1A2E"/>
+                <w:sz w:val="21"/>
+                <w:szCs w:val="21"/>
+              </w:rPr>
+              <w:t>Visioball</w:t>
+            </w:r>
+            <w:proofErr w:type="spellEnd"/>
+            <w:r>
+              <w:rPr>
+                <w:rFonts w:ascii="Segoe UI" w:eastAsia="Times New Roman" w:hAnsi="Segoe UI" w:cs="Segoe UI"/>
+                <w:color w:val="1A1A2E"/>
+                <w:sz w:val="21"/>
+                <w:szCs w:val="21"/>
+              </w:rPr>
+              <w:t xml:space="preserve"> and allow Bluetooth (nearby devices) and Location.</w:t>
             </w:r>
           </w:p>
         </w:tc>
@@ -8219,12 +8512,14 @@
                 <w:szCs w:val="21"/>
               </w:rPr>
             </w:pPr>
+            <w:proofErr w:type="spellStart"/>
             <w:r>
               <w:rPr>
                 <w:rStyle w:val="HTMLCode"/>
               </w:rPr>
               <w:t>VisioBal</w:t>
             </w:r>
+            <w:proofErr w:type="spellEnd"/>
           </w:p>
         </w:tc>
       </w:tr>
@@ -8294,14 +8589,25 @@
                 <w:szCs w:val="21"/>
               </w:rPr>
             </w:pPr>
-            <w:r>
-              <w:rPr>
-                <w:rFonts w:ascii="Segoe UI" w:eastAsia="Times New Roman" w:hAnsi="Segoe UI" w:cs="Segoe UI"/>
-                <w:color w:val="1A1A2E"/>
-                <w:sz w:val="21"/>
-                <w:szCs w:val="21"/>
-              </w:rPr>
-              <w:t>visiobal (this project)</w:t>
+            <w:proofErr w:type="spellStart"/>
+            <w:r>
+              <w:rPr>
+                <w:rFonts w:ascii="Segoe UI" w:eastAsia="Times New Roman" w:hAnsi="Segoe UI" w:cs="Segoe UI"/>
+                <w:color w:val="1A1A2E"/>
+                <w:sz w:val="21"/>
+                <w:szCs w:val="21"/>
+              </w:rPr>
+              <w:t>visiobal</w:t>
+            </w:r>
+            <w:proofErr w:type="spellEnd"/>
+            <w:r>
+              <w:rPr>
+                <w:rFonts w:ascii="Segoe UI" w:eastAsia="Times New Roman" w:hAnsi="Segoe UI" w:cs="Segoe UI"/>
+                <w:color w:val="1A1A2E"/>
+                <w:sz w:val="21"/>
+                <w:szCs w:val="21"/>
+              </w:rPr>
+              <w:t xml:space="preserve"> (this project)</w:t>
             </w:r>
           </w:p>
         </w:tc>
@@ -8372,14 +8678,45 @@
                 <w:szCs w:val="21"/>
               </w:rPr>
             </w:pPr>
-            <w:r>
-              <w:rPr>
-                <w:rFonts w:ascii="Segoe UI" w:eastAsia="Times New Roman" w:hAnsi="Segoe UI" w:cs="Segoe UI"/>
-                <w:color w:val="1A1A2E"/>
-                <w:sz w:val="21"/>
-                <w:szCs w:val="21"/>
-              </w:rPr>
-              <w:t>visiobal-hardware (PlatformIO / ESP32)</w:t>
+            <w:proofErr w:type="spellStart"/>
+            <w:r>
+              <w:rPr>
+                <w:rFonts w:ascii="Segoe UI" w:eastAsia="Times New Roman" w:hAnsi="Segoe UI" w:cs="Segoe UI"/>
+                <w:color w:val="1A1A2E"/>
+                <w:sz w:val="21"/>
+                <w:szCs w:val="21"/>
+              </w:rPr>
+              <w:t>visiobal</w:t>
+            </w:r>
+            <w:proofErr w:type="spellEnd"/>
+            <w:r>
+              <w:rPr>
+                <w:rFonts w:ascii="Segoe UI" w:eastAsia="Times New Roman" w:hAnsi="Segoe UI" w:cs="Segoe UI"/>
+                <w:color w:val="1A1A2E"/>
+                <w:sz w:val="21"/>
+                <w:szCs w:val="21"/>
+              </w:rPr>
+              <w:t>-hardware (</w:t>
+            </w:r>
+            <w:proofErr w:type="spellStart"/>
+            <w:r>
+              <w:rPr>
+                <w:rFonts w:ascii="Segoe UI" w:eastAsia="Times New Roman" w:hAnsi="Segoe UI" w:cs="Segoe UI"/>
+                <w:color w:val="1A1A2E"/>
+                <w:sz w:val="21"/>
+                <w:szCs w:val="21"/>
+              </w:rPr>
+              <w:t>PlatformIO</w:t>
+            </w:r>
+            <w:proofErr w:type="spellEnd"/>
+            <w:r>
+              <w:rPr>
+                <w:rFonts w:ascii="Segoe UI" w:eastAsia="Times New Roman" w:hAnsi="Segoe UI" w:cs="Segoe UI"/>
+                <w:color w:val="1A1A2E"/>
+                <w:sz w:val="21"/>
+                <w:szCs w:val="21"/>
+              </w:rPr>
+              <w:t xml:space="preserve"> / ESP32)</w:t>
             </w:r>
           </w:p>
         </w:tc>
@@ -8472,12 +8809,21 @@
           <w:lang w:val="en"/>
         </w:rPr>
       </w:pPr>
+      <w:proofErr w:type="spellStart"/>
       <w:r>
         <w:rPr>
           <w:rFonts w:ascii="Segoe UI" w:hAnsi="Segoe UI" w:cs="Segoe UI"/>
           <w:lang w:val="en"/>
         </w:rPr>
-        <w:t>Visioball is a student prototype, provided as-is for learning and demonstration. Features may be incomplete.</w:t>
+        <w:t>Visioball</w:t>
+      </w:r>
+      <w:proofErr w:type="spellEnd"/>
+      <w:r>
+        <w:rPr>
+          <w:rFonts w:ascii="Segoe UI" w:hAnsi="Segoe UI" w:cs="Segoe UI"/>
+          <w:lang w:val="en"/>
+        </w:rPr>
+        <w:t xml:space="preserve"> is a student prototype, provided as-is for learning and demonstration. Features may be incomplete.</w:t>
       </w:r>
     </w:p>
     <w:sectPr>
@@ -8491,7 +8837,7 @@
 </file>
 
 <file path=word/numbering.xml><?xml version="1.0" encoding="utf-8"?>
-<w:numbering xmlns:wpc="http://schemas.microsoft.com/office/word/2010/wordprocessingCanvas" xmlns:cx="http://schemas.microsoft.com/office/drawing/2014/chartex" xmlns:mc="http://schemas.openxmlformats.org/markup-compatibility/2006" xmlns:o="urn:schemas-microsoft-com:office:office" xmlns:r="http://schemas.openxmlformats.org/officeDocument/2006/relationships" xmlns:m="http://schemas.openxmlformats.org/officeDocument/2006/math" xmlns:v="urn:schemas-microsoft-com:vml" xmlns:wp14="http://schemas.microsoft.com/office/word/2010/wordprocessingDrawing" xmlns:wp="http://schemas.openxmlformats.org/drawingml/2006/wordprocessingDrawing" xmlns:w10="urn:schemas-microsoft-com:office:word" xmlns:w="http://schemas.openxmlformats.org/wordprocessingml/2006/main" xmlns:w14="http://schemas.microsoft.com/office/word/2010/wordml" xmlns:w15="http://schemas.microsoft.com/office/word/2012/wordml" xmlns:w16se="http://schemas.microsoft.com/office/word/2015/wordml/symex" xmlns:wpg="http://schemas.microsoft.com/office/word/2010/wordprocessingGroup" xmlns:wpi="http://schemas.microsoft.com/office/word/2010/wordprocessingInk" xmlns:wne="http://schemas.microsoft.com/office/word/2006/wordml" xmlns:wps="http://schemas.microsoft.com/office/word/2010/wordprocessingShape" mc:Ignorable="w14 w15 w16se wp14">
+<w:numbering xmlns:wpc="http://schemas.microsoft.com/office/word/2010/wordprocessingCanvas" xmlns:cx="http://schemas.microsoft.com/office/drawing/2014/chartex" xmlns:cx1="http://schemas.microsoft.com/office/drawing/2015/9/8/chartex" xmlns:cx2="http://schemas.microsoft.com/office/drawing/2015/10/21/chartex" xmlns:cx3="http://schemas.microsoft.com/office/drawing/2016/5/9/chartex" xmlns:cx4="http://schemas.microsoft.com/office/drawing/2016/5/10/chartex" xmlns:cx5="http://schemas.microsoft.com/office/drawing/2016/5/11/chartex" xmlns:cx6="http://schemas.microsoft.com/office/drawing/2016/5/12/chartex" xmlns:cx7="http://schemas.microsoft.com/office/drawing/2016/5/13/chartex" xmlns:cx8="http://schemas.microsoft.com/office/drawing/2016/5/14/chartex" xmlns:mc="http://schemas.openxmlformats.org/markup-compatibility/2006" xmlns:aink="http://schemas.microsoft.com/office/drawing/2016/ink" xmlns:am3d="http://schemas.microsoft.com/office/drawing/2017/model3d" xmlns:o="urn:schemas-microsoft-com:office:office" xmlns:oel="http://schemas.microsoft.com/office/2019/extlst" xmlns:r="http://schemas.openxmlformats.org/officeDocument/2006/relationships" xmlns:m="http://schemas.openxmlformats.org/officeDocument/2006/math" xmlns:v="urn:schemas-microsoft-com:vml" xmlns:wp14="http://schemas.microsoft.com/office/word/2010/wordprocessingDrawing" xmlns:wp="http://schemas.openxmlformats.org/drawingml/2006/wordprocessingDrawing" xmlns:w10="urn:schemas-microsoft-com:office:word" xmlns:w="http://schemas.openxmlformats.org/wordprocessingml/2006/main" xmlns:w14="http://schemas.microsoft.com/office/word/2010/wordml" xmlns:w15="http://schemas.microsoft.com/office/word/2012/wordml" xmlns:w16cex="http://schemas.microsoft.com/office/word/2018/wordml/cex" xmlns:w16cid="http://schemas.microsoft.com/office/word/2016/wordml/cid" xmlns:w16="http://schemas.microsoft.com/office/word/2018/wordml" xmlns:w16du="http://schemas.microsoft.com/office/word/2023/wordml/word16du" xmlns:w16sdtdh="http://schemas.microsoft.com/office/word/2020/wordml/sdtdatahash" xmlns:w16sdtfl="http://schemas.microsoft.com/office/word/2024/wordml/sdtformatlock" xmlns:w16se="http://schemas.microsoft.com/office/word/2015/wordml/symex" xmlns:wpg="http://schemas.microsoft.com/office/word/2010/wordprocessingGroup" xmlns:wpi="http://schemas.microsoft.com/office/word/2010/wordprocessingInk" xmlns:wne="http://schemas.microsoft.com/office/word/2006/wordml" xmlns:wps="http://schemas.microsoft.com/office/word/2010/wordprocessingShape" mc:Ignorable="w14 w15 w16se w16cid w16 w16cex w16sdtdh w16sdtfl w16du wp14">
   <w:abstractNum w:abstractNumId="0" w15:restartNumberingAfterBreak="0">
     <w:nsid w:val="0B4911C1"/>
     <w:multiLevelType w:val="multilevel"/>
@@ -10362,53 +10708,53 @@
       </w:rPr>
     </w:lvl>
   </w:abstractNum>
-  <w:num w:numId="1">
+  <w:num w:numId="1" w16cid:durableId="2102725420">
     <w:abstractNumId w:val="5"/>
   </w:num>
-  <w:num w:numId="2">
+  <w:num w:numId="2" w16cid:durableId="301732383">
     <w:abstractNumId w:val="3"/>
   </w:num>
-  <w:num w:numId="3">
+  <w:num w:numId="3" w16cid:durableId="1651909415">
     <w:abstractNumId w:val="12"/>
   </w:num>
-  <w:num w:numId="4">
+  <w:num w:numId="4" w16cid:durableId="1602299634">
     <w:abstractNumId w:val="2"/>
   </w:num>
-  <w:num w:numId="5">
+  <w:num w:numId="5" w16cid:durableId="1922980974">
     <w:abstractNumId w:val="8"/>
   </w:num>
-  <w:num w:numId="6">
+  <w:num w:numId="6" w16cid:durableId="1534884227">
     <w:abstractNumId w:val="9"/>
   </w:num>
-  <w:num w:numId="7">
+  <w:num w:numId="7" w16cid:durableId="1418600782">
     <w:abstractNumId w:val="7"/>
   </w:num>
-  <w:num w:numId="8">
+  <w:num w:numId="8" w16cid:durableId="205682420">
     <w:abstractNumId w:val="6"/>
   </w:num>
-  <w:num w:numId="9">
+  <w:num w:numId="9" w16cid:durableId="2005429637">
     <w:abstractNumId w:val="0"/>
   </w:num>
-  <w:num w:numId="10">
+  <w:num w:numId="10" w16cid:durableId="1661040136">
     <w:abstractNumId w:val="13"/>
   </w:num>
-  <w:num w:numId="11">
+  <w:num w:numId="11" w16cid:durableId="1120949639">
     <w:abstractNumId w:val="10"/>
   </w:num>
-  <w:num w:numId="12">
+  <w:num w:numId="12" w16cid:durableId="1129008696">
     <w:abstractNumId w:val="1"/>
   </w:num>
-  <w:num w:numId="13">
+  <w:num w:numId="13" w16cid:durableId="1736049947">
     <w:abstractNumId w:val="4"/>
   </w:num>
-  <w:num w:numId="14">
+  <w:num w:numId="14" w16cid:durableId="1515728946">
     <w:abstractNumId w:val="11"/>
   </w:num>
 </w:numbering>
 </file>
 
 <file path=word/styles.xml><?xml version="1.0" encoding="utf-8"?>
-<w:styles xmlns:mc="http://schemas.openxmlformats.org/markup-compatibility/2006" xmlns:r="http://schemas.openxmlformats.org/officeDocument/2006/relationships" xmlns:w="http://schemas.openxmlformats.org/wordprocessingml/2006/main" xmlns:w14="http://schemas.microsoft.com/office/word/2010/wordml" xmlns:w15="http://schemas.microsoft.com/office/word/2012/wordml" xmlns:w16se="http://schemas.microsoft.com/office/word/2015/wordml/symex" mc:Ignorable="w14 w15 w16se">
+<w:styles xmlns:mc="http://schemas.openxmlformats.org/markup-compatibility/2006" xmlns:r="http://schemas.openxmlformats.org/officeDocument/2006/relationships" xmlns:w="http://schemas.openxmlformats.org/wordprocessingml/2006/main" xmlns:w14="http://schemas.microsoft.com/office/word/2010/wordml" xmlns:w15="http://schemas.microsoft.com/office/word/2012/wordml" xmlns:w16cex="http://schemas.microsoft.com/office/word/2018/wordml/cex" xmlns:w16cid="http://schemas.microsoft.com/office/word/2016/wordml/cid" xmlns:w16="http://schemas.microsoft.com/office/word/2018/wordml" xmlns:w16du="http://schemas.microsoft.com/office/word/2023/wordml/word16du" xmlns:w16sdtdh="http://schemas.microsoft.com/office/word/2020/wordml/sdtdatahash" xmlns:w16sdtfl="http://schemas.microsoft.com/office/word/2024/wordml/sdtformatlock" xmlns:w16se="http://schemas.microsoft.com/office/word/2015/wordml/symex" mc:Ignorable="w14 w15 w16se w16cid w16 w16cex w16sdtdh w16sdtfl w16du">
   <w:docDefaults>
     <w:rPrDefault>
       <w:rPr>
@@ -10418,7 +10764,7 @@
     </w:rPrDefault>
     <w:pPrDefault/>
   </w:docDefaults>
-  <w:latentStyles w:defLockedState="0" w:defUIPriority="99" w:defSemiHidden="0" w:defUnhideWhenUsed="0" w:defQFormat="0" w:count="371">
+  <w:latentStyles w:defLockedState="0" w:defUIPriority="99" w:defSemiHidden="0" w:defUnhideWhenUsed="0" w:defQFormat="0" w:count="376">
     <w:lsdException w:name="Normal" w:uiPriority="0" w:qFormat="1"/>
     <w:lsdException w:name="heading 1" w:uiPriority="9" w:qFormat="1"/>
     <w:lsdException w:name="heading 2" w:uiPriority="9" w:qFormat="1"/>
@@ -10790,6 +11136,11 @@
     <w:lsdException w:name="List Table 5 Dark Accent 6" w:uiPriority="50"/>
     <w:lsdException w:name="List Table 6 Colorful Accent 6" w:uiPriority="51"/>
     <w:lsdException w:name="List Table 7 Colorful Accent 6" w:uiPriority="52"/>
+    <w:lsdException w:name="Mention" w:semiHidden="1" w:unhideWhenUsed="1"/>
+    <w:lsdException w:name="Smart Hyperlink" w:semiHidden="1" w:unhideWhenUsed="1"/>
+    <w:lsdException w:name="Hashtag" w:semiHidden="1" w:unhideWhenUsed="1"/>
+    <w:lsdException w:name="Unresolved Mention" w:semiHidden="1" w:unhideWhenUsed="1"/>
+    <w:lsdException w:name="Smart Link" w:semiHidden="1" w:unhideWhenUsed="1"/>
   </w:latentStyles>
   <w:style w:type="paragraph" w:default="1" w:styleId="Normal">
     <w:name w:val="Normal"/>

</xml_diff>